<commit_message>
Focus AI TPM portfolio, restore recent impact and AI delivery, close timeline gap, and remove public phone
</commit_message>
<xml_diff>
--- a/resumes/Joane_Aristilde_AI_Product_Manager.docx
+++ b/resumes/Joane_Aristilde_AI_Product_Manager.docx
@@ -82,7 +82,7 @@
           <w:color w:val="404040" w:themeColor="text1" w:themeTint="BF"/>
           <w:szCs w:val="20"/>
         </w:rPr>
-        <w:t xml:space="preserve">Miami, FL | 305-332-5401 | </w:t>
+        <w:t xml:space="preserve">Miami, FL | </w:t>
       </w:r>
       <w:hyperlink r:id="rId6" w:history="1">
         <w:r>
@@ -1097,9 +1097,7 @@
         </w:rPr>
         <w:t>Managed scope, budgets, schedules, and risks for data-platform projects within PMO standards; coordinated offshore engineering and Agile delivery.</w:t>
       </w:r>
-      <w:r>
-        <w:br w:type="page"/>
-      </w:r>
+      <w:r/>
     </w:p>
     <w:p>
       <w:pPr>
@@ -1233,20 +1231,6 @@
           <w:rFonts w:ascii="Calibri Light" w:hAnsi="Calibri Light" w:cs="Calibri Light"/>
         </w:rPr>
         <w:t>Connected a React/TypeScript interface to a Node.js/Express and PostgreSQL back end, with Prisma and Stripe; deployed the platform on Netlify and Render.</w:t>
-      </w:r>
-    </w:p>
-    <w:p>
-      <w:pPr>
-        <w:spacing w:line="276" w:lineRule="auto"/>
-        <w:rPr>
-          <w:rFonts w:ascii="Calibri Light" w:hAnsi="Calibri Light" w:cs="Calibri Light"/>
-        </w:rPr>
-      </w:pPr>
-      <w:r>
-        <w:rPr>
-          <w:rFonts w:ascii="Calibri Light" w:hAnsi="Calibri Light" w:cs="Calibri Light"/>
-        </w:rPr>
-        <w:t>Project repository: github.com/Jaristilde/Heritage-condo-management</w:t>
       </w:r>
     </w:p>
     <w:p>

</xml_diff>